<commit_message>
Discover links: fix to discover links with  scanned PDF and pictures
</commit_message>
<xml_diff>
--- a/Specs/Demo_Narrative.docx
+++ b/Specs/Demo_Narrative.docx
@@ -2,6 +2,1158 @@
 <file path=word/document.xml><?xml version="1.0" encoding="utf-8"?>
 <w:document xmlns:wpc="http://schemas.microsoft.com/office/word/2010/wordprocessingCanvas" xmlns:cx="http://schemas.microsoft.com/office/drawing/2014/chartex" xmlns:cx1="http://schemas.microsoft.com/office/drawing/2015/9/8/chartex" xmlns:cx2="http://schemas.microsoft.com/office/drawing/2015/10/21/chartex" xmlns:cx3="http://schemas.microsoft.com/office/drawing/2016/5/9/chartex" xmlns:cx4="http://schemas.microsoft.com/office/drawing/2016/5/10/chartex" xmlns:cx5="http://schemas.microsoft.com/office/drawing/2016/5/11/chartex" xmlns:cx6="http://schemas.microsoft.com/office/drawing/2016/5/12/chartex" xmlns:cx7="http://schemas.microsoft.com/office/drawing/2016/5/13/chartex" xmlns:cx8="http://schemas.microsoft.com/office/drawing/2016/5/14/chartex" xmlns:mc="http://schemas.openxmlformats.org/markup-compatibility/2006" xmlns:aink="http://schemas.microsoft.com/office/drawing/2016/ink" xmlns:am3d="http://schemas.microsoft.com/office/drawing/2017/model3d" xmlns:o="urn:schemas-microsoft-com:office:office" xmlns:oel="http://schemas.microsoft.com/office/2019/extlst" xmlns:r="http://schemas.openxmlformats.org/officeDocument/2006/relationships" xmlns:m="http://schemas.openxmlformats.org/officeDocument/2006/math" xmlns:v="urn:schemas-microsoft-com:vml" xmlns:wp14="http://schemas.microsoft.com/office/word/2010/wordprocessingDrawing" xmlns:wp="http://schemas.openxmlformats.org/drawingml/2006/wordprocessingDrawing" xmlns:w10="urn:schemas-microsoft-com:office:word" xmlns:w="http://schemas.openxmlformats.org/wordprocessingml/2006/main" xmlns:w14="http://schemas.microsoft.com/office/word/2010/wordml" xmlns:w15="http://schemas.microsoft.com/office/word/2012/wordml" xmlns:w16cex="http://schemas.microsoft.com/office/word/2018/wordml/cex" xmlns:w16cid="http://schemas.microsoft.com/office/word/2016/wordml/cid" xmlns:w16="http://schemas.microsoft.com/office/word/2018/wordml" xmlns:w16sdtdh="http://schemas.microsoft.com/office/word/2020/wordml/sdtdatahash" xmlns:w16se="http://schemas.microsoft.com/office/word/2015/wordml/symex" xmlns:wpg="http://schemas.microsoft.com/office/word/2010/wordprocessingGroup" xmlns:wpi="http://schemas.microsoft.com/office/word/2010/wordprocessingInk" xmlns:wne="http://schemas.microsoft.com/office/word/2006/wordml" xmlns:wps="http://schemas.microsoft.com/office/word/2010/wordprocessingShape" mc:Ignorable="w14 w15 w16se w16cid w16 w16cex w16sdtdh wp14">
   <w:body>
+    <w:p>
+      <w:pPr>
+        <w:pStyle w:val="Titre1"/>
+      </w:pPr>
+      <w:r>
+        <w:t>1 – The concept</w:t>
+      </w:r>
+    </w:p>
+    <w:p>
+      <w:pPr>
+        <w:pStyle w:val="Paragraphedeliste"/>
+        <w:numPr>
+          <w:ilvl w:val="0"/>
+          <w:numId w:val="1"/>
+        </w:numPr>
+      </w:pPr>
+      <w:r>
+        <w:t>Real Application: Back-end, front-end, DB, Embeddings, multiple LLMs – Not a mockup</w:t>
+      </w:r>
+    </w:p>
+    <w:p>
+      <w:pPr>
+        <w:pStyle w:val="Paragraphedeliste"/>
+        <w:numPr>
+          <w:ilvl w:val="0"/>
+          <w:numId w:val="1"/>
+        </w:numPr>
+      </w:pPr>
+      <w:r>
+        <w:t xml:space="preserve">Drift in how we represent the natural interaction with AI, due to the market momentum of </w:t>
+      </w:r>
+      <w:proofErr w:type="spellStart"/>
+      <w:r>
+        <w:t>chatgpt</w:t>
+      </w:r>
+      <w:proofErr w:type="spellEnd"/>
+      <w:r>
+        <w:t xml:space="preserve"> etc. We think the chatbot IS the right interface.</w:t>
+      </w:r>
+    </w:p>
+    <w:p>
+      <w:pPr>
+        <w:pStyle w:val="Paragraphedeliste"/>
+        <w:numPr>
+          <w:ilvl w:val="0"/>
+          <w:numId w:val="1"/>
+        </w:numPr>
+      </w:pPr>
+      <w:r>
+        <w:t>This is not always true. Actually in the real world we work on assets (documents, etc.), we do not spend our time discussing with someone. Chatbot relevant for some cases but not all.</w:t>
+      </w:r>
+    </w:p>
+    <w:p>
+      <w:pPr>
+        <w:pStyle w:val="Paragraphedeliste"/>
+        <w:numPr>
+          <w:ilvl w:val="0"/>
+          <w:numId w:val="1"/>
+        </w:numPr>
+      </w:pPr>
+      <w:r>
+        <w:t>This is why I invented the “</w:t>
+      </w:r>
+      <w:proofErr w:type="spellStart"/>
+      <w:r>
+        <w:t>Semactic</w:t>
+      </w:r>
+      <w:proofErr w:type="spellEnd"/>
+      <w:r>
+        <w:t xml:space="preserve"> </w:t>
+      </w:r>
+      <w:proofErr w:type="spellStart"/>
+      <w:r>
+        <w:t>Cancas</w:t>
+      </w:r>
+      <w:proofErr w:type="spellEnd"/>
+      <w:r>
+        <w:t>”. The idea is to start from documents and work around documents with the help of AI.</w:t>
+      </w:r>
+    </w:p>
+    <w:p>
+      <w:pPr>
+        <w:pStyle w:val="Titre1"/>
+      </w:pPr>
+      <w:r>
+        <w:t>2 – The interface</w:t>
+      </w:r>
+    </w:p>
+    <w:p>
+      <w:r>
+        <w:t>Start with empty Canvas</w:t>
+      </w:r>
+    </w:p>
+    <w:p>
+      <w:pPr>
+        <w:pStyle w:val="Paragraphedeliste"/>
+        <w:numPr>
+          <w:ilvl w:val="0"/>
+          <w:numId w:val="1"/>
+        </w:numPr>
+      </w:pPr>
+      <w:r>
+        <w:t>The main work area is the “Canvas”. We come back at it later</w:t>
+      </w:r>
+    </w:p>
+    <w:p>
+      <w:pPr>
+        <w:pStyle w:val="Paragraphedeliste"/>
+        <w:numPr>
+          <w:ilvl w:val="0"/>
+          <w:numId w:val="1"/>
+        </w:numPr>
+      </w:pPr>
+      <w:r>
+        <w:t>Left panel: the different tools. Settings, Research, Templates, Smart Analysis, Agents &amp; Tools, Workflows</w:t>
+      </w:r>
+    </w:p>
+    <w:p>
+      <w:pPr>
+        <w:pStyle w:val="Paragraphedeliste"/>
+        <w:numPr>
+          <w:ilvl w:val="0"/>
+          <w:numId w:val="1"/>
+        </w:numPr>
+      </w:pPr>
+      <w:r>
+        <w:t>List of Canvas</w:t>
+      </w:r>
+    </w:p>
+    <w:p>
+      <w:pPr>
+        <w:pStyle w:val="Paragraphedeliste"/>
+        <w:numPr>
+          <w:ilvl w:val="0"/>
+          <w:numId w:val="1"/>
+        </w:numPr>
+      </w:pPr>
+      <w:r>
+        <w:t>We also have a chatbot</w:t>
+      </w:r>
+    </w:p>
+    <w:p>
+      <w:pPr>
+        <w:pStyle w:val="Paragraphedeliste"/>
+        <w:numPr>
+          <w:ilvl w:val="0"/>
+          <w:numId w:val="1"/>
+        </w:numPr>
+      </w:pPr>
+      <w:r>
+        <w:t>At the top: Models to use, Sync all (we’ll see later)</w:t>
+      </w:r>
+    </w:p>
+    <w:p>
+      <w:pPr>
+        <w:pStyle w:val="Paragraphedeliste"/>
+        <w:numPr>
+          <w:ilvl w:val="0"/>
+          <w:numId w:val="1"/>
+        </w:numPr>
+      </w:pPr>
+      <w:r>
+        <w:t>At the right: tools</w:t>
+      </w:r>
+    </w:p>
+    <w:p>
+      <w:pPr>
+        <w:pStyle w:val="Titre1"/>
+      </w:pPr>
+      <w:r>
+        <w:t>3 – Working with the canvas – basics</w:t>
+      </w:r>
+    </w:p>
+    <w:p>
+      <w:pPr>
+        <w:pStyle w:val="Paragraphedeliste"/>
+        <w:numPr>
+          <w:ilvl w:val="0"/>
+          <w:numId w:val="1"/>
+        </w:numPr>
+      </w:pPr>
+      <w:r>
+        <w:t xml:space="preserve">Adding a document : </w:t>
+      </w:r>
+      <w:r>
+        <w:t>2025-0460-d.pdf</w:t>
+      </w:r>
+    </w:p>
+    <w:p>
+      <w:pPr>
+        <w:pStyle w:val="Paragraphedeliste"/>
+        <w:numPr>
+          <w:ilvl w:val="1"/>
+          <w:numId w:val="1"/>
+        </w:numPr>
+      </w:pPr>
+      <w:r>
+        <w:t>RAG – embeddings are created</w:t>
+      </w:r>
+    </w:p>
+    <w:p>
+      <w:pPr>
+        <w:pStyle w:val="Paragraphedeliste"/>
+        <w:numPr>
+          <w:ilvl w:val="1"/>
+          <w:numId w:val="1"/>
+        </w:numPr>
+      </w:pPr>
+      <w:r>
+        <w:t xml:space="preserve">A new </w:t>
+      </w:r>
+      <w:r>
+        <w:rPr>
+          <w:b/>
+          <w:bCs/>
+        </w:rPr>
+        <w:t>Thing</w:t>
+      </w:r>
+      <w:r>
+        <w:t xml:space="preserve"> appears: show how to move node, zoom in and out, change size of node.</w:t>
+      </w:r>
+    </w:p>
+    <w:p>
+      <w:pPr>
+        <w:pStyle w:val="Paragraphedeliste"/>
+        <w:numPr>
+          <w:ilvl w:val="1"/>
+          <w:numId w:val="1"/>
+        </w:numPr>
+      </w:pPr>
+      <w:r>
+        <w:t>Explain “Thing”</w:t>
+      </w:r>
+    </w:p>
+    <w:p>
+      <w:pPr>
+        <w:pStyle w:val="Paragraphedeliste"/>
+        <w:numPr>
+          <w:ilvl w:val="1"/>
+          <w:numId w:val="1"/>
+        </w:numPr>
+      </w:pPr>
+      <w:r>
+        <w:t xml:space="preserve">At the end – </w:t>
+      </w:r>
+      <w:r>
+        <w:rPr>
+          <w:b/>
+          <w:bCs/>
+        </w:rPr>
+        <w:t>Green brain</w:t>
+      </w:r>
+      <w:r>
+        <w:t xml:space="preserve"> – show</w:t>
+      </w:r>
+      <w:r>
+        <w:t xml:space="preserve"> content</w:t>
+      </w:r>
+    </w:p>
+    <w:p>
+      <w:pPr>
+        <w:pStyle w:val="Paragraphedeliste"/>
+        <w:numPr>
+          <w:ilvl w:val="0"/>
+          <w:numId w:val="1"/>
+        </w:numPr>
+      </w:pPr>
+      <w:r>
+        <w:t>Let’s add another document:</w:t>
+      </w:r>
+    </w:p>
+    <w:p>
+      <w:pPr>
+        <w:pStyle w:val="Paragraphedeliste"/>
+        <w:numPr>
+          <w:ilvl w:val="1"/>
+          <w:numId w:val="1"/>
+        </w:numPr>
+      </w:pPr>
+      <w:r>
+        <w:t xml:space="preserve">Show the document </w:t>
+      </w:r>
+      <w:r>
+        <w:t>StatistikAlter_LQ.pdf</w:t>
+      </w:r>
+      <w:r>
+        <w:t>: very bad quality</w:t>
+      </w:r>
+    </w:p>
+    <w:p>
+      <w:pPr>
+        <w:pStyle w:val="Paragraphedeliste"/>
+        <w:numPr>
+          <w:ilvl w:val="1"/>
+          <w:numId w:val="1"/>
+        </w:numPr>
+      </w:pPr>
+      <w:r>
+        <w:t xml:space="preserve">It is a </w:t>
+      </w:r>
+      <w:r>
+        <w:rPr>
+          <w:b/>
+          <w:bCs/>
+        </w:rPr>
+        <w:t>scanned</w:t>
+      </w:r>
+      <w:r>
+        <w:t xml:space="preserve"> document</w:t>
+      </w:r>
+    </w:p>
+    <w:p>
+      <w:pPr>
+        <w:pStyle w:val="Paragraphedeliste"/>
+        <w:numPr>
+          <w:ilvl w:val="1"/>
+          <w:numId w:val="1"/>
+        </w:numPr>
+      </w:pPr>
+      <w:r>
+        <w:t>Takes a bit longer</w:t>
+      </w:r>
+      <w:r>
+        <w:t xml:space="preserve"> – explain we have the VL remote and a local embeddings model to store the result</w:t>
+      </w:r>
+    </w:p>
+    <w:p>
+      <w:pPr>
+        <w:pStyle w:val="Paragraphedeliste"/>
+        <w:numPr>
+          <w:ilvl w:val="1"/>
+          <w:numId w:val="1"/>
+        </w:numPr>
+      </w:pPr>
+      <w:r>
+        <w:t xml:space="preserve">At the end show </w:t>
+      </w:r>
+      <w:r>
+        <w:rPr>
+          <w:b/>
+          <w:bCs/>
+        </w:rPr>
+        <w:t>Green brain</w:t>
+      </w:r>
+      <w:r>
+        <w:t>: we have the transcription of the scanned PDF</w:t>
+      </w:r>
+    </w:p>
+    <w:p>
+      <w:pPr>
+        <w:pStyle w:val="Paragraphedeliste"/>
+        <w:numPr>
+          <w:ilvl w:val="0"/>
+          <w:numId w:val="1"/>
+        </w:numPr>
+      </w:pPr>
+      <w:r>
+        <w:t xml:space="preserve">Add another document: a text document for example : </w:t>
+      </w:r>
+    </w:p>
+    <w:p>
+      <w:pPr>
+        <w:pStyle w:val="Paragraphedeliste"/>
+        <w:numPr>
+          <w:ilvl w:val="0"/>
+          <w:numId w:val="1"/>
+        </w:numPr>
+      </w:pPr>
+      <w:r>
+        <w:t xml:space="preserve">Let’s add another document: an excel file for example: </w:t>
+      </w:r>
+      <w:r>
+        <w:t>je-d-13.02.02.09.xlsx</w:t>
+      </w:r>
+    </w:p>
+    <w:p>
+      <w:pPr>
+        <w:pStyle w:val="Paragraphedeliste"/>
+        <w:numPr>
+          <w:ilvl w:val="1"/>
+          <w:numId w:val="1"/>
+        </w:numPr>
+      </w:pPr>
+      <w:r>
+        <w:t xml:space="preserve">Start to show the icons: full screen the Excel node and show we can </w:t>
+      </w:r>
+      <w:r>
+        <w:rPr>
+          <w:b/>
+          <w:bCs/>
+        </w:rPr>
+        <w:t>select tabs and cells</w:t>
+      </w:r>
+    </w:p>
+    <w:p>
+      <w:pPr>
+        <w:pStyle w:val="Paragraphedeliste"/>
+        <w:numPr>
+          <w:ilvl w:val="1"/>
+          <w:numId w:val="1"/>
+        </w:numPr>
+      </w:pPr>
+      <w:r>
+        <w:t xml:space="preserve">Explain that as we get more and more documents, the canvas may become cluttered, so </w:t>
+      </w:r>
+      <w:r>
+        <w:rPr>
+          <w:b/>
+          <w:bCs/>
+        </w:rPr>
+        <w:t>iconize</w:t>
+      </w:r>
+    </w:p>
+    <w:p>
+      <w:pPr>
+        <w:pStyle w:val="Paragraphedeliste"/>
+        <w:numPr>
+          <w:ilvl w:val="1"/>
+          <w:numId w:val="1"/>
+        </w:numPr>
+      </w:pPr>
+      <w:r>
+        <w:rPr>
+          <w:b/>
+          <w:bCs/>
+        </w:rPr>
+        <w:t>Copy</w:t>
+      </w:r>
+      <w:r>
+        <w:t xml:space="preserve"> icon that copies the content of the Green brain – show it on the </w:t>
+      </w:r>
+      <w:r>
+        <w:t>Scanned</w:t>
+      </w:r>
+      <w:r>
+        <w:t xml:space="preserve"> document</w:t>
+      </w:r>
+    </w:p>
+    <w:p>
+      <w:pPr>
+        <w:pStyle w:val="Paragraphedeliste"/>
+        <w:numPr>
+          <w:ilvl w:val="0"/>
+          <w:numId w:val="1"/>
+        </w:numPr>
+      </w:pPr>
+      <w:r>
+        <w:t xml:space="preserve">Add a </w:t>
+      </w:r>
+      <w:proofErr w:type="spellStart"/>
+      <w:r>
+        <w:t>powerpoint</w:t>
+      </w:r>
+      <w:proofErr w:type="spellEnd"/>
+      <w:r>
+        <w:rPr>
+          <w:b/>
+          <w:bCs/>
+        </w:rPr>
+        <w:t xml:space="preserve"> “Image slides” : </w:t>
+      </w:r>
+      <w:proofErr w:type="spellStart"/>
+      <w:r>
+        <w:rPr>
+          <w:b/>
+          <w:bCs/>
+        </w:rPr>
+        <w:t>Bauausgaben</w:t>
+      </w:r>
+      <w:proofErr w:type="spellEnd"/>
+      <w:r>
+        <w:rPr>
+          <w:b/>
+          <w:bCs/>
+        </w:rPr>
+        <w:t xml:space="preserve"> Schweiz 2024</w:t>
+      </w:r>
+    </w:p>
+    <w:p>
+      <w:pPr>
+        <w:pStyle w:val="Paragraphedeliste"/>
+        <w:numPr>
+          <w:ilvl w:val="1"/>
+          <w:numId w:val="1"/>
+        </w:numPr>
+      </w:pPr>
+      <w:r>
+        <w:t>Describe how it creates the analysis of the pictures</w:t>
+      </w:r>
+    </w:p>
+    <w:p>
+      <w:pPr>
+        <w:pStyle w:val="Paragraphedeliste"/>
+        <w:numPr>
+          <w:ilvl w:val="0"/>
+          <w:numId w:val="1"/>
+        </w:numPr>
+      </w:pPr>
+      <w:r>
+        <w:t xml:space="preserve">Add a </w:t>
+      </w:r>
+      <w:proofErr w:type="spellStart"/>
+      <w:r>
+        <w:rPr>
+          <w:b/>
+          <w:bCs/>
+        </w:rPr>
+        <w:t>powerpoint</w:t>
+      </w:r>
+      <w:proofErr w:type="spellEnd"/>
+      <w:r>
+        <w:t xml:space="preserve"> </w:t>
+      </w:r>
+      <w:r>
+        <w:t>“</w:t>
+      </w:r>
+      <w:r>
+        <w:t>fy11_sh-22316-11_1-3_ProcessingMapping.pptx</w:t>
+      </w:r>
+      <w:r>
+        <w:t xml:space="preserve">” </w:t>
+      </w:r>
+      <w:r>
+        <w:t>and show the display. Explain how complex that is. Explain how costly the commercial libraries are and that there is no open source library for that.</w:t>
+      </w:r>
+    </w:p>
+    <w:p>
+      <w:pPr>
+        <w:pStyle w:val="Paragraphedeliste"/>
+        <w:numPr>
+          <w:ilvl w:val="1"/>
+          <w:numId w:val="1"/>
+        </w:numPr>
+      </w:pPr>
+      <w:r>
+        <w:t xml:space="preserve">Work in </w:t>
+      </w:r>
+      <w:proofErr w:type="spellStart"/>
+      <w:r>
+        <w:t>poregsse</w:t>
+      </w:r>
+      <w:proofErr w:type="spellEnd"/>
+      <w:r>
+        <w:t xml:space="preserve"> but promising. And The aim is not to have a perfect representation but a usable one.</w:t>
+      </w:r>
+    </w:p>
+    <w:p>
+      <w:pPr>
+        <w:pStyle w:val="Paragraphedeliste"/>
+        <w:numPr>
+          <w:ilvl w:val="0"/>
+          <w:numId w:val="1"/>
+        </w:numPr>
+      </w:pPr>
+      <w:r>
+        <w:t xml:space="preserve">We </w:t>
+      </w:r>
+      <w:r>
+        <w:t>are starting to have qui</w:t>
+      </w:r>
+      <w:r>
+        <w:t>te</w:t>
+      </w:r>
+      <w:r>
+        <w:t xml:space="preserve"> a significant amount of things on the canvas. It requires a bit of </w:t>
+      </w:r>
+      <w:r>
+        <w:t>organization.</w:t>
+      </w:r>
+    </w:p>
+    <w:p>
+      <w:pPr>
+        <w:pStyle w:val="Paragraphedeliste"/>
+        <w:numPr>
+          <w:ilvl w:val="0"/>
+          <w:numId w:val="1"/>
+        </w:numPr>
+      </w:pPr>
+      <w:r>
+        <w:t>Create two domains :</w:t>
+      </w:r>
+      <w:r>
+        <w:rPr>
+          <w:b/>
+          <w:bCs/>
+        </w:rPr>
+        <w:t xml:space="preserve"> “</w:t>
+      </w:r>
+      <w:proofErr w:type="spellStart"/>
+      <w:r>
+        <w:rPr>
+          <w:b/>
+          <w:bCs/>
+        </w:rPr>
+        <w:t>Sozialversicherung</w:t>
+      </w:r>
+      <w:proofErr w:type="spellEnd"/>
+      <w:r>
+        <w:rPr>
+          <w:b/>
+          <w:bCs/>
+        </w:rPr>
+        <w:t xml:space="preserve">” </w:t>
+      </w:r>
+      <w:r>
+        <w:t>and</w:t>
+      </w:r>
+      <w:r>
+        <w:rPr>
+          <w:b/>
+          <w:bCs/>
+        </w:rPr>
+        <w:t xml:space="preserve"> “</w:t>
+      </w:r>
+      <w:proofErr w:type="spellStart"/>
+      <w:r>
+        <w:rPr>
+          <w:b/>
+          <w:bCs/>
+        </w:rPr>
+        <w:t>Bau</w:t>
+      </w:r>
+      <w:proofErr w:type="spellEnd"/>
+      <w:r>
+        <w:rPr>
+          <w:b/>
+          <w:bCs/>
+        </w:rPr>
+        <w:t>”</w:t>
+      </w:r>
+      <w:r>
+        <w:rPr>
+          <w:b/>
+          <w:bCs/>
+        </w:rPr>
+        <w:t xml:space="preserve"> (“</w:t>
+      </w:r>
+      <w:r>
+        <w:rPr>
+          <w:b/>
+          <w:bCs/>
+        </w:rPr>
+        <w:t xml:space="preserve">Statistics about buildings in </w:t>
+      </w:r>
+      <w:r>
+        <w:rPr>
+          <w:b/>
+          <w:bCs/>
+        </w:rPr>
+        <w:t>Switzerland”)</w:t>
+      </w:r>
+    </w:p>
+    <w:p>
+      <w:pPr>
+        <w:pStyle w:val="Paragraphedeliste"/>
+        <w:numPr>
+          <w:ilvl w:val="1"/>
+          <w:numId w:val="1"/>
+        </w:numPr>
+      </w:pPr>
+      <w:r>
+        <w:t>The domains are not just “</w:t>
+      </w:r>
+      <w:r>
+        <w:t>rectangles” they have a meaning. They encompass things and the analysis that we can do apply to the things in the domain. The “context” of the domain is composed of the things it contains.</w:t>
+      </w:r>
+    </w:p>
+    <w:p>
+      <w:pPr>
+        <w:pStyle w:val="Paragraphedeliste"/>
+        <w:numPr>
+          <w:ilvl w:val="1"/>
+          <w:numId w:val="1"/>
+        </w:numPr>
+      </w:pPr>
+      <w:r>
+        <w:t>Reorganize the things in the domains</w:t>
+      </w:r>
+    </w:p>
+    <w:p>
+      <w:pPr>
+        <w:pStyle w:val="Titre1"/>
+      </w:pPr>
+      <w:r>
+        <w:t>4 – Working with Things – the toolbox</w:t>
+      </w:r>
+    </w:p>
+    <w:p>
+      <w:pPr>
+        <w:pStyle w:val="Paragraphedeliste"/>
+        <w:numPr>
+          <w:ilvl w:val="0"/>
+          <w:numId w:val="1"/>
+        </w:numPr>
+      </w:pPr>
+      <w:r>
+        <w:t>Notice the toolbox. Show the different icons</w:t>
+      </w:r>
+    </w:p>
+    <w:p>
+      <w:pPr>
+        <w:pStyle w:val="Paragraphedeliste"/>
+        <w:numPr>
+          <w:ilvl w:val="1"/>
+          <w:numId w:val="1"/>
+        </w:numPr>
+      </w:pPr>
+      <w:r>
+        <w:t>Start with “</w:t>
+      </w:r>
+      <w:r>
+        <w:rPr>
+          <w:b/>
+          <w:bCs/>
+        </w:rPr>
+        <w:t>Explain</w:t>
+      </w:r>
+      <w:r>
+        <w:t xml:space="preserve">”. Select the document </w:t>
+      </w:r>
+      <w:r>
+        <w:t>2025-0460-d.pdf</w:t>
+      </w:r>
+      <w:r>
+        <w:t xml:space="preserve"> and explain</w:t>
+      </w:r>
+    </w:p>
+    <w:p>
+      <w:pPr>
+        <w:pStyle w:val="Paragraphedeliste"/>
+        <w:numPr>
+          <w:ilvl w:val="1"/>
+          <w:numId w:val="1"/>
+        </w:numPr>
+      </w:pPr>
+      <w:r>
+        <w:t>Continue with “</w:t>
+      </w:r>
+      <w:r>
+        <w:rPr>
+          <w:b/>
+          <w:bCs/>
+        </w:rPr>
+        <w:t>Summarize</w:t>
+      </w:r>
+      <w:r>
+        <w:t>”</w:t>
+      </w:r>
+    </w:p>
+    <w:p>
+      <w:pPr>
+        <w:pStyle w:val="Paragraphedeliste"/>
+        <w:numPr>
+          <w:ilvl w:val="1"/>
+          <w:numId w:val="1"/>
+        </w:numPr>
+      </w:pPr>
+      <w:r>
+        <w:t>Continue with “</w:t>
+      </w:r>
+      <w:r>
+        <w:rPr>
+          <w:b/>
+          <w:bCs/>
+        </w:rPr>
+        <w:t>Extract key points</w:t>
+      </w:r>
+      <w:r>
+        <w:t>”</w:t>
+      </w:r>
+    </w:p>
+    <w:p>
+      <w:pPr>
+        <w:pStyle w:val="Paragraphedeliste"/>
+        <w:numPr>
+          <w:ilvl w:val="1"/>
+          <w:numId w:val="1"/>
+        </w:numPr>
+      </w:pPr>
+      <w:r>
+        <w:t>Continue with “Ask about this” and enter “</w:t>
+      </w:r>
+      <w:r>
+        <w:t xml:space="preserve">Was </w:t>
+      </w:r>
+      <w:proofErr w:type="spellStart"/>
+      <w:r>
+        <w:t>ist</w:t>
+      </w:r>
+      <w:proofErr w:type="spellEnd"/>
+      <w:r>
+        <w:t xml:space="preserve"> der </w:t>
+      </w:r>
+      <w:proofErr w:type="spellStart"/>
+      <w:r>
+        <w:t>Medianbertag</w:t>
+      </w:r>
+      <w:proofErr w:type="spellEnd"/>
+      <w:r>
+        <w:t xml:space="preserve"> pro person?</w:t>
+      </w:r>
+      <w:r>
+        <w:t>”</w:t>
+      </w:r>
+    </w:p>
+    <w:p>
+      <w:pPr>
+        <w:pStyle w:val="Paragraphedeliste"/>
+        <w:numPr>
+          <w:ilvl w:val="2"/>
+          <w:numId w:val="1"/>
+        </w:numPr>
+      </w:pPr>
+      <w:r>
+        <w:t>The answer is in German and the result is correct</w:t>
+      </w:r>
+    </w:p>
+    <w:p>
+      <w:pPr>
+        <w:pStyle w:val="Paragraphedeliste"/>
+        <w:numPr>
+          <w:ilvl w:val="1"/>
+          <w:numId w:val="1"/>
+        </w:numPr>
+      </w:pPr>
+      <w:r>
+        <w:t>On this node, do a few things</w:t>
+      </w:r>
+    </w:p>
+    <w:p>
+      <w:pPr>
+        <w:pStyle w:val="Paragraphedeliste"/>
+        <w:numPr>
+          <w:ilvl w:val="2"/>
+          <w:numId w:val="1"/>
+        </w:numPr>
+      </w:pPr>
+      <w:r>
+        <w:t>Change the title “</w:t>
+      </w:r>
+      <w:proofErr w:type="spellStart"/>
+      <w:r>
+        <w:t>Medianbetrag</w:t>
+      </w:r>
+      <w:proofErr w:type="spellEnd"/>
+      <w:r>
+        <w:t>”</w:t>
+      </w:r>
+    </w:p>
+    <w:p>
+      <w:pPr>
+        <w:pStyle w:val="Paragraphedeliste"/>
+        <w:numPr>
+          <w:ilvl w:val="2"/>
+          <w:numId w:val="1"/>
+        </w:numPr>
+      </w:pPr>
+      <w:r>
+        <w:t>Edit the content with the pencil. Remove the summary at the end.</w:t>
+      </w:r>
+    </w:p>
+    <w:p>
+      <w:pPr>
+        <w:pStyle w:val="Paragraphedeliste"/>
+        <w:numPr>
+          <w:ilvl w:val="2"/>
+          <w:numId w:val="1"/>
+        </w:numPr>
+      </w:pPr>
+      <w:r>
+        <w:rPr>
+          <w:b/>
+          <w:bCs/>
+        </w:rPr>
+        <w:t>Copy</w:t>
+      </w:r>
+      <w:r>
+        <w:t xml:space="preserve"> icon that copies the content of the Green brain – show it on the Scanned document</w:t>
+      </w:r>
+    </w:p>
+    <w:p>
+      <w:pPr>
+        <w:pStyle w:val="Paragraphedeliste"/>
+        <w:numPr>
+          <w:ilvl w:val="2"/>
+          <w:numId w:val="1"/>
+        </w:numPr>
+      </w:pPr>
+      <w:r>
+        <w:rPr>
+          <w:b/>
+          <w:bCs/>
+        </w:rPr>
+        <w:t>Export</w:t>
+      </w:r>
+      <w:r>
+        <w:t xml:space="preserve"> icon </w:t>
+      </w:r>
+      <w:r>
+        <w:t>to Markdown</w:t>
+      </w:r>
+    </w:p>
+    <w:p>
+      <w:pPr>
+        <w:pStyle w:val="Paragraphedeliste"/>
+        <w:numPr>
+          <w:ilvl w:val="1"/>
+          <w:numId w:val="1"/>
+        </w:numPr>
+      </w:pPr>
+      <w:r>
+        <w:t>Notice that the text Things that get created are linked to the Thing they are related to</w:t>
+      </w:r>
+    </w:p>
+    <w:p>
+      <w:pPr>
+        <w:pStyle w:val="Paragraphedeliste"/>
+        <w:numPr>
+          <w:ilvl w:val="0"/>
+          <w:numId w:val="1"/>
+        </w:numPr>
+      </w:pPr>
+      <w:r>
+        <w:t xml:space="preserve">Add a </w:t>
+      </w:r>
+      <w:r>
+        <w:rPr>
+          <w:b/>
+          <w:bCs/>
+        </w:rPr>
+        <w:t>composed document</w:t>
+      </w:r>
+      <w:r>
+        <w:t xml:space="preserve">: </w:t>
+      </w:r>
+      <w:r>
+        <w:t>AHV Flexibility Summary.pdf</w:t>
+      </w:r>
+    </w:p>
+    <w:p>
+      <w:pPr>
+        <w:pStyle w:val="Paragraphedeliste"/>
+        <w:numPr>
+          <w:ilvl w:val="1"/>
+          <w:numId w:val="1"/>
+        </w:numPr>
+      </w:pPr>
+      <w:r>
+        <w:t xml:space="preserve">Select a text. Talk about the </w:t>
+      </w:r>
+      <w:r>
+        <w:rPr>
+          <w:b/>
+          <w:bCs/>
+        </w:rPr>
+        <w:t>green toolbox</w:t>
+      </w:r>
+    </w:p>
+    <w:p>
+      <w:pPr>
+        <w:pStyle w:val="Paragraphedeliste"/>
+        <w:numPr>
+          <w:ilvl w:val="1"/>
+          <w:numId w:val="1"/>
+        </w:numPr>
+      </w:pPr>
+      <w:r>
+        <w:rPr>
+          <w:b/>
+          <w:bCs/>
+        </w:rPr>
+        <w:t>Explain</w:t>
+      </w:r>
+      <w:r>
+        <w:t xml:space="preserve"> the text using the icon</w:t>
+      </w:r>
+    </w:p>
+    <w:p>
+      <w:pPr>
+        <w:pStyle w:val="Paragraphedeliste"/>
+        <w:numPr>
+          <w:ilvl w:val="1"/>
+          <w:numId w:val="1"/>
+        </w:numPr>
+      </w:pPr>
+      <w:r>
+        <w:t xml:space="preserve">We can do that with graphics too: </w:t>
+      </w:r>
+      <w:r>
+        <w:t>Select a Chart</w:t>
+      </w:r>
+      <w:r>
+        <w:t xml:space="preserve"> and ask for </w:t>
+      </w:r>
+      <w:r>
+        <w:rPr>
+          <w:b/>
+          <w:bCs/>
+        </w:rPr>
+        <w:t>Summary</w:t>
+      </w:r>
+      <w:r>
+        <w:t>.</w:t>
+      </w:r>
+    </w:p>
+    <w:p>
+      <w:pPr>
+        <w:pStyle w:val="Paragraphedeliste"/>
+        <w:numPr>
+          <w:ilvl w:val="2"/>
+          <w:numId w:val="1"/>
+        </w:numPr>
+      </w:pPr>
+      <w:r>
+        <w:t>Explain the id of the graphic fragment</w:t>
+      </w:r>
+      <w:r>
+        <w:t xml:space="preserve"> and notice the ID is used as the title for the created text node</w:t>
+      </w:r>
+    </w:p>
+    <w:p>
+      <w:pPr>
+        <w:pStyle w:val="Paragraphedeliste"/>
+        <w:numPr>
+          <w:ilvl w:val="2"/>
+          <w:numId w:val="1"/>
+        </w:numPr>
+      </w:pPr>
+      <w:r>
+        <w:t>Show that the fragment can be changed in size</w:t>
+      </w:r>
+    </w:p>
+    <w:p>
+      <w:pPr>
+        <w:pStyle w:val="Paragraphedeliste"/>
+        <w:numPr>
+          <w:ilvl w:val="2"/>
+          <w:numId w:val="1"/>
+        </w:numPr>
+      </w:pPr>
+      <w:r>
+        <w:t>Show that one can delete the fragment. Delete the fragment.</w:t>
+      </w:r>
+    </w:p>
+    <w:p>
+      <w:pPr>
+        <w:pStyle w:val="Titre1"/>
+      </w:pPr>
+      <w:r>
+        <w:t>5 – Links</w:t>
+      </w:r>
+    </w:p>
+    <w:p>
+      <w:pPr>
+        <w:pStyle w:val="Paragraphedeliste"/>
+        <w:numPr>
+          <w:ilvl w:val="0"/>
+          <w:numId w:val="1"/>
+        </w:numPr>
+      </w:pPr>
+      <w:r>
+        <w:t xml:space="preserve">We have seen that analyses are linked to the document they analyze. </w:t>
+      </w:r>
+    </w:p>
+    <w:p>
+      <w:pPr>
+        <w:pStyle w:val="Paragraphedeliste"/>
+        <w:numPr>
+          <w:ilvl w:val="0"/>
+          <w:numId w:val="1"/>
+        </w:numPr>
+      </w:pPr>
+      <w:r>
+        <w:t>Now notice the orange handles at the side</w:t>
+      </w:r>
+    </w:p>
+    <w:p>
+      <w:pPr>
+        <w:pStyle w:val="Paragraphedeliste"/>
+        <w:numPr>
+          <w:ilvl w:val="0"/>
+          <w:numId w:val="1"/>
+        </w:numPr>
+      </w:pPr>
+      <w:r>
+        <w:t>This allows to create links between things. Let’s link two things.</w:t>
+      </w:r>
+    </w:p>
+    <w:p>
+      <w:pPr>
+        <w:pStyle w:val="Paragraphedeliste"/>
+        <w:numPr>
+          <w:ilvl w:val="1"/>
+          <w:numId w:val="1"/>
+        </w:numPr>
+      </w:pPr>
+      <w:r>
+        <w:t>We can decide the type of link</w:t>
+      </w:r>
+    </w:p>
+    <w:p>
+      <w:pPr>
+        <w:pStyle w:val="Paragraphedeliste"/>
+        <w:numPr>
+          <w:ilvl w:val="1"/>
+          <w:numId w:val="1"/>
+        </w:numPr>
+      </w:pPr>
+      <w:r>
+        <w:t>And we must add a description. The label is important because it creates the context and the explanation that we will use with the graph</w:t>
+      </w:r>
+    </w:p>
+    <w:p>
+      <w:pPr>
+        <w:pStyle w:val="Paragraphedeliste"/>
+        <w:numPr>
+          <w:ilvl w:val="1"/>
+          <w:numId w:val="1"/>
+        </w:numPr>
+      </w:pPr>
+      <w:r>
+        <w:t>You have understood that we are creating a labelled graph, I.e. a knowledge graph</w:t>
+      </w:r>
+    </w:p>
+    <w:p>
+      <w:pPr>
+        <w:pStyle w:val="Paragraphedeliste"/>
+        <w:numPr>
+          <w:ilvl w:val="0"/>
+          <w:numId w:val="1"/>
+        </w:numPr>
+      </w:pPr>
+      <w:r>
+        <w:t xml:space="preserve">Now we may not know what are the relationships between the different nodes on the </w:t>
+      </w:r>
+      <w:r>
+        <w:t>canvas. Maybe we can get some help</w:t>
+      </w:r>
+    </w:p>
+    <w:p>
+      <w:pPr>
+        <w:pStyle w:val="Paragraphedeliste"/>
+        <w:numPr>
+          <w:ilvl w:val="1"/>
+          <w:numId w:val="1"/>
+        </w:numPr>
+      </w:pPr>
+      <w:r>
+        <w:t>Right click on the canvas to display</w:t>
+      </w:r>
+    </w:p>
+    <w:p/>
     <w:p/>
     <w:sectPr>
       <w:pgSz w:w="12240" w:h="15840"/>
@@ -11,6 +1163,127 @@
     </w:sectPr>
   </w:body>
 </w:document>
+</file>
+
+<file path=word/numbering.xml><?xml version="1.0" encoding="utf-8"?>
+<w:numbering xmlns:wpc="http://schemas.microsoft.com/office/word/2010/wordprocessingCanvas" xmlns:cx="http://schemas.microsoft.com/office/drawing/2014/chartex" xmlns:cx1="http://schemas.microsoft.com/office/drawing/2015/9/8/chartex" xmlns:cx2="http://schemas.microsoft.com/office/drawing/2015/10/21/chartex" xmlns:cx3="http://schemas.microsoft.com/office/drawing/2016/5/9/chartex" xmlns:cx4="http://schemas.microsoft.com/office/drawing/2016/5/10/chartex" xmlns:cx5="http://schemas.microsoft.com/office/drawing/2016/5/11/chartex" xmlns:cx6="http://schemas.microsoft.com/office/drawing/2016/5/12/chartex" xmlns:cx7="http://schemas.microsoft.com/office/drawing/2016/5/13/chartex" xmlns:cx8="http://schemas.microsoft.com/office/drawing/2016/5/14/chartex" xmlns:mc="http://schemas.openxmlformats.org/markup-compatibility/2006" xmlns:aink="http://schemas.microsoft.com/office/drawing/2016/ink" xmlns:am3d="http://schemas.microsoft.com/office/drawing/2017/model3d" xmlns:o="urn:schemas-microsoft-com:office:office" xmlns:oel="http://schemas.microsoft.com/office/2019/extlst" xmlns:r="http://schemas.openxmlformats.org/officeDocument/2006/relationships" xmlns:m="http://schemas.openxmlformats.org/officeDocument/2006/math" xmlns:v="urn:schemas-microsoft-com:vml" xmlns:wp14="http://schemas.microsoft.com/office/word/2010/wordprocessingDrawing" xmlns:wp="http://schemas.openxmlformats.org/drawingml/2006/wordprocessingDrawing" xmlns:w10="urn:schemas-microsoft-com:office:word" xmlns:w="http://schemas.openxmlformats.org/wordprocessingml/2006/main" xmlns:w14="http://schemas.microsoft.com/office/word/2010/wordml" xmlns:w15="http://schemas.microsoft.com/office/word/2012/wordml" xmlns:w16cex="http://schemas.microsoft.com/office/word/2018/wordml/cex" xmlns:w16cid="http://schemas.microsoft.com/office/word/2016/wordml/cid" xmlns:w16="http://schemas.microsoft.com/office/word/2018/wordml" xmlns:w16sdtdh="http://schemas.microsoft.com/office/word/2020/wordml/sdtdatahash" xmlns:w16se="http://schemas.microsoft.com/office/word/2015/wordml/symex" xmlns:wpg="http://schemas.microsoft.com/office/word/2010/wordprocessingGroup" xmlns:wpi="http://schemas.microsoft.com/office/word/2010/wordprocessingInk" xmlns:wne="http://schemas.microsoft.com/office/word/2006/wordml" xmlns:wps="http://schemas.microsoft.com/office/word/2010/wordprocessingShape" mc:Ignorable="w14 w15 w16se w16cid w16 w16cex w16sdtdh wp14">
+  <w:abstractNum w:abstractNumId="0" w15:restartNumberingAfterBreak="0">
+    <w:nsid w:val="5CE57834"/>
+    <w:multiLevelType w:val="hybridMultilevel"/>
+    <w:tmpl w:val="8E48CA9C"/>
+    <w:lvl w:ilvl="0" w:tplc="A0A2D9AE">
+      <w:start w:val="1"/>
+      <w:numFmt w:val="bullet"/>
+      <w:lvlText w:val="-"/>
+      <w:lvlJc w:val="left"/>
+      <w:pPr>
+        <w:ind w:left="720" w:hanging="360"/>
+      </w:pPr>
+      <w:rPr>
+        <w:rFonts w:ascii="Aptos" w:eastAsiaTheme="minorHAnsi" w:hAnsi="Aptos" w:cstheme="minorBidi" w:hint="default"/>
+      </w:rPr>
+    </w:lvl>
+    <w:lvl w:ilvl="1" w:tplc="04090003">
+      <w:start w:val="1"/>
+      <w:numFmt w:val="bullet"/>
+      <w:lvlText w:val="o"/>
+      <w:lvlJc w:val="left"/>
+      <w:pPr>
+        <w:ind w:left="1440" w:hanging="360"/>
+      </w:pPr>
+      <w:rPr>
+        <w:rFonts w:ascii="Courier New" w:hAnsi="Courier New" w:cs="Courier New" w:hint="default"/>
+      </w:rPr>
+    </w:lvl>
+    <w:lvl w:ilvl="2" w:tplc="04090005">
+      <w:start w:val="1"/>
+      <w:numFmt w:val="bullet"/>
+      <w:lvlText w:val=""/>
+      <w:lvlJc w:val="left"/>
+      <w:pPr>
+        <w:ind w:left="2160" w:hanging="360"/>
+      </w:pPr>
+      <w:rPr>
+        <w:rFonts w:ascii="Wingdings" w:hAnsi="Wingdings" w:hint="default"/>
+      </w:rPr>
+    </w:lvl>
+    <w:lvl w:ilvl="3" w:tplc="04090001" w:tentative="1">
+      <w:start w:val="1"/>
+      <w:numFmt w:val="bullet"/>
+      <w:lvlText w:val=""/>
+      <w:lvlJc w:val="left"/>
+      <w:pPr>
+        <w:ind w:left="2880" w:hanging="360"/>
+      </w:pPr>
+      <w:rPr>
+        <w:rFonts w:ascii="Symbol" w:hAnsi="Symbol" w:hint="default"/>
+      </w:rPr>
+    </w:lvl>
+    <w:lvl w:ilvl="4" w:tplc="04090003" w:tentative="1">
+      <w:start w:val="1"/>
+      <w:numFmt w:val="bullet"/>
+      <w:lvlText w:val="o"/>
+      <w:lvlJc w:val="left"/>
+      <w:pPr>
+        <w:ind w:left="3600" w:hanging="360"/>
+      </w:pPr>
+      <w:rPr>
+        <w:rFonts w:ascii="Courier New" w:hAnsi="Courier New" w:cs="Courier New" w:hint="default"/>
+      </w:rPr>
+    </w:lvl>
+    <w:lvl w:ilvl="5" w:tplc="04090005" w:tentative="1">
+      <w:start w:val="1"/>
+      <w:numFmt w:val="bullet"/>
+      <w:lvlText w:val=""/>
+      <w:lvlJc w:val="left"/>
+      <w:pPr>
+        <w:ind w:left="4320" w:hanging="360"/>
+      </w:pPr>
+      <w:rPr>
+        <w:rFonts w:ascii="Wingdings" w:hAnsi="Wingdings" w:hint="default"/>
+      </w:rPr>
+    </w:lvl>
+    <w:lvl w:ilvl="6" w:tplc="04090001" w:tentative="1">
+      <w:start w:val="1"/>
+      <w:numFmt w:val="bullet"/>
+      <w:lvlText w:val=""/>
+      <w:lvlJc w:val="left"/>
+      <w:pPr>
+        <w:ind w:left="5040" w:hanging="360"/>
+      </w:pPr>
+      <w:rPr>
+        <w:rFonts w:ascii="Symbol" w:hAnsi="Symbol" w:hint="default"/>
+      </w:rPr>
+    </w:lvl>
+    <w:lvl w:ilvl="7" w:tplc="04090003" w:tentative="1">
+      <w:start w:val="1"/>
+      <w:numFmt w:val="bullet"/>
+      <w:lvlText w:val="o"/>
+      <w:lvlJc w:val="left"/>
+      <w:pPr>
+        <w:ind w:left="5760" w:hanging="360"/>
+      </w:pPr>
+      <w:rPr>
+        <w:rFonts w:ascii="Courier New" w:hAnsi="Courier New" w:cs="Courier New" w:hint="default"/>
+      </w:rPr>
+    </w:lvl>
+    <w:lvl w:ilvl="8" w:tplc="04090005" w:tentative="1">
+      <w:start w:val="1"/>
+      <w:numFmt w:val="bullet"/>
+      <w:lvlText w:val=""/>
+      <w:lvlJc w:val="left"/>
+      <w:pPr>
+        <w:ind w:left="6480" w:hanging="360"/>
+      </w:pPr>
+      <w:rPr>
+        <w:rFonts w:ascii="Wingdings" w:hAnsi="Wingdings" w:hint="default"/>
+      </w:rPr>
+    </w:lvl>
+  </w:abstractNum>
+  <w:num w:numId="1" w16cid:durableId="249117765">
+    <w:abstractNumId w:val="0"/>
+  </w:num>
+</w:numbering>
 </file>
 
 <file path=word/styles.xml><?xml version="1.0" encoding="utf-8"?>

</xml_diff>

<commit_message>
Samrt Analysis:: fix to process PDF
</commit_message>
<xml_diff>
--- a/Specs/Demo_Narrative.docx
+++ b/Specs/Demo_Narrative.docx
@@ -7,6 +7,25 @@
         <w:pStyle w:val="Titre1"/>
       </w:pPr>
       <w:r>
+        <w:t>PREPARATION</w:t>
+      </w:r>
+    </w:p>
+    <w:p>
+      <w:r>
+        <w:t>One canvas with document “</w:t>
+      </w:r>
+      <w:r>
+        <w:t>Kurzversion_API-Architektur-Bund_V1-0.pdf</w:t>
+      </w:r>
+      <w:r>
+        <w:t xml:space="preserve">” </w:t>
+      </w:r>
+    </w:p>
+    <w:p>
+      <w:pPr>
+        <w:pStyle w:val="Titre1"/>
+      </w:pPr>
+      <w:r>
         <w:t>1 – The concept</w:t>
       </w:r>
     </w:p>
@@ -145,6 +164,18 @@
     </w:p>
     <w:p>
       <w:pPr>
+        <w:pStyle w:val="Paragraphedeliste"/>
+        <w:numPr>
+          <w:ilvl w:val="0"/>
+          <w:numId w:val="1"/>
+        </w:numPr>
+      </w:pPr>
+      <w:r>
+        <w:t>Show quickly the help</w:t>
+      </w:r>
+    </w:p>
+    <w:p>
+      <w:pPr>
         <w:pStyle w:val="Titre1"/>
       </w:pPr>
       <w:r>
@@ -1171,6 +1202,18 @@
         <w:t>Link Discovery</w:t>
       </w:r>
     </w:p>
+    <w:p>
+      <w:pPr>
+        <w:pStyle w:val="Paragraphedeliste"/>
+        <w:numPr>
+          <w:ilvl w:val="0"/>
+          <w:numId w:val="1"/>
+        </w:numPr>
+      </w:pPr>
+      <w:r>
+        <w:t>Show that the colors are useful. The links are coloured. But you can also change the color of the types of node with a dedicated icon on the node button at the right panel.</w:t>
+      </w:r>
+    </w:p>
     <w:p/>
     <w:p>
       <w:pPr>
@@ -1184,6 +1227,9 @@
       <w:r>
         <w:t>I know you want the chatbot. We have seen the possibility to ask a question.</w:t>
       </w:r>
+      <w:r>
+        <w:t xml:space="preserve"> We have done already a LOT of things without the chatbot. But we can also chat…</w:t>
+      </w:r>
     </w:p>
     <w:p>
       <w:r>
@@ -1256,10 +1302,761 @@
         </w:numPr>
       </w:pPr>
       <w:r>
-        <w:t>Let’s asl another question: „W</w:t>
-      </w:r>
-      <w:r>
-        <w:t>hat is the AHV?”. In the answer there are several sources. If we click on a source, the focus is made on the corresponding node.</w:t>
+        <w:t>Let’s asl another question:</w:t>
+      </w:r>
+      <w:r>
+        <w:t xml:space="preserve"> </w:t>
+      </w:r>
+      <w:r>
+        <w:rPr>
+          <w:b/>
+          <w:bCs/>
+        </w:rPr>
+        <w:t>Use the microphone</w:t>
+      </w:r>
+      <w:r>
+        <w:t xml:space="preserve">. </w:t>
+      </w:r>
+      <w:r>
+        <w:t xml:space="preserve"> „W</w:t>
+      </w:r>
+      <w:r>
+        <w:t xml:space="preserve">hat is the AHV?”. </w:t>
+      </w:r>
+    </w:p>
+    <w:p>
+      <w:pPr>
+        <w:pStyle w:val="Paragraphedeliste"/>
+        <w:numPr>
+          <w:ilvl w:val="1"/>
+          <w:numId w:val="1"/>
+        </w:numPr>
+      </w:pPr>
+      <w:r>
+        <w:t xml:space="preserve">In the answer there are several sources. If we </w:t>
+      </w:r>
+      <w:r>
+        <w:rPr>
+          <w:b/>
+          <w:bCs/>
+        </w:rPr>
+        <w:t>click on a source,</w:t>
+      </w:r>
+      <w:r>
+        <w:t xml:space="preserve"> the focus is made on the corresponding node.</w:t>
+      </w:r>
+    </w:p>
+    <w:p>
+      <w:pPr>
+        <w:pStyle w:val="Paragraphedeliste"/>
+        <w:numPr>
+          <w:ilvl w:val="0"/>
+          <w:numId w:val="1"/>
+        </w:numPr>
+      </w:pPr>
+      <w:r>
+        <w:t xml:space="preserve">Notice that the </w:t>
+      </w:r>
+      <w:r>
+        <w:rPr>
+          <w:b/>
+          <w:bCs/>
+        </w:rPr>
+        <w:t>name of the conversation</w:t>
+      </w:r>
+      <w:r>
+        <w:t xml:space="preserve"> has been automatically adapted based on the first question.</w:t>
+      </w:r>
+    </w:p>
+    <w:p>
+      <w:pPr>
+        <w:pStyle w:val="Paragraphedeliste"/>
+        <w:numPr>
+          <w:ilvl w:val="0"/>
+          <w:numId w:val="1"/>
+        </w:numPr>
+      </w:pPr>
+      <w:r>
+        <w:t xml:space="preserve">Show that we can also </w:t>
+      </w:r>
+      <w:r>
+        <w:rPr>
+          <w:b/>
+          <w:bCs/>
+        </w:rPr>
+        <w:t>rename a canvas</w:t>
+      </w:r>
+      <w:r>
+        <w:t xml:space="preserve"> automatically</w:t>
+      </w:r>
+    </w:p>
+    <w:p>
+      <w:pPr>
+        <w:pStyle w:val="Paragraphedeliste"/>
+        <w:numPr>
+          <w:ilvl w:val="0"/>
+          <w:numId w:val="1"/>
+        </w:numPr>
+      </w:pPr>
+      <w:r>
+        <w:rPr>
+          <w:b/>
+          <w:bCs/>
+        </w:rPr>
+        <w:t>Double-click</w:t>
+      </w:r>
+      <w:r>
+        <w:t xml:space="preserve"> on the conversation</w:t>
+      </w:r>
+      <w:r>
+        <w:t xml:space="preserve"> title or click on the “open Conversation” icon</w:t>
+      </w:r>
+      <w:r>
+        <w:t xml:space="preserve"> to show that </w:t>
+      </w:r>
+      <w:r>
+        <w:t>this conversation</w:t>
+      </w:r>
+      <w:r>
+        <w:t xml:space="preserve"> is also added to the history in the chatbot</w:t>
+      </w:r>
+    </w:p>
+    <w:p>
+      <w:pPr>
+        <w:pStyle w:val="Titre1"/>
+      </w:pPr>
+      <w:r>
+        <w:t>7 – Dynamic Things</w:t>
+      </w:r>
+    </w:p>
+    <w:p>
+      <w:pPr>
+        <w:pStyle w:val="Paragraphedeliste"/>
+        <w:numPr>
+          <w:ilvl w:val="0"/>
+          <w:numId w:val="1"/>
+        </w:numPr>
+      </w:pPr>
+      <w:r>
+        <w:t>The Canvas is not restricted to static things. We can also have dynamic Things on the Canvas. Like APIs</w:t>
+      </w:r>
+    </w:p>
+    <w:p>
+      <w:pPr>
+        <w:pStyle w:val="Paragraphedeliste"/>
+        <w:numPr>
+          <w:ilvl w:val="0"/>
+          <w:numId w:val="1"/>
+        </w:numPr>
+      </w:pPr>
+      <w:r>
+        <w:t>APIs are accessed through MC servers</w:t>
+      </w:r>
+    </w:p>
+    <w:p>
+      <w:pPr>
+        <w:pStyle w:val="Paragraphedeliste"/>
+        <w:numPr>
+          <w:ilvl w:val="0"/>
+          <w:numId w:val="1"/>
+        </w:numPr>
+      </w:pPr>
+      <w:r>
+        <w:t xml:space="preserve">I have built an MCP server that provides a bunch of test APIs. These are not </w:t>
+      </w:r>
+      <w:r>
+        <w:t>Stubs but real APIs accessing remote servers on the web. There is an API for retrieving a picture, an API for retrieving information about a country, there is a API that queries a local database of 200.000 records etc.</w:t>
+      </w:r>
+    </w:p>
+    <w:p>
+      <w:pPr>
+        <w:pStyle w:val="Paragraphedeliste"/>
+        <w:numPr>
+          <w:ilvl w:val="0"/>
+          <w:numId w:val="1"/>
+        </w:numPr>
+      </w:pPr>
+      <w:r>
+        <w:t>Show the settings of MCP Servers</w:t>
+      </w:r>
+    </w:p>
+    <w:p>
+      <w:pPr>
+        <w:pStyle w:val="Paragraphedeliste"/>
+        <w:numPr>
+          <w:ilvl w:val="1"/>
+          <w:numId w:val="1"/>
+        </w:numPr>
+      </w:pPr>
+      <w:r>
+        <w:t>Test connection</w:t>
+      </w:r>
+    </w:p>
+    <w:p>
+      <w:pPr>
+        <w:pStyle w:val="Paragraphedeliste"/>
+        <w:numPr>
+          <w:ilvl w:val="0"/>
+          <w:numId w:val="1"/>
+        </w:numPr>
+      </w:pPr>
+      <w:r>
+        <w:t xml:space="preserve">Let’s add a </w:t>
+      </w:r>
+      <w:r>
+        <w:rPr>
+          <w:b/>
+          <w:bCs/>
+        </w:rPr>
+        <w:t xml:space="preserve">MCP </w:t>
+      </w:r>
+      <w:r>
+        <w:rPr>
+          <w:b/>
+          <w:bCs/>
+        </w:rPr>
+        <w:t>tool</w:t>
+      </w:r>
+      <w:r>
+        <w:t xml:space="preserve"> to the Canvas</w:t>
+      </w:r>
+    </w:p>
+    <w:p>
+      <w:pPr>
+        <w:pStyle w:val="Paragraphedeliste"/>
+        <w:numPr>
+          <w:ilvl w:val="0"/>
+          <w:numId w:val="1"/>
+        </w:numPr>
+      </w:pPr>
+      <w:r>
+        <w:t xml:space="preserve">Use the </w:t>
+      </w:r>
+      <w:r>
+        <w:rPr>
+          <w:b/>
+          <w:bCs/>
+        </w:rPr>
+        <w:t>get_country_info</w:t>
+      </w:r>
+      <w:r>
+        <w:t>, start with France and run</w:t>
+      </w:r>
+    </w:p>
+    <w:p>
+      <w:pPr>
+        <w:pStyle w:val="Paragraphedeliste"/>
+        <w:numPr>
+          <w:ilvl w:val="0"/>
+          <w:numId w:val="1"/>
+        </w:numPr>
+      </w:pPr>
+      <w:r>
+        <w:t>Change the country (Algeria), run</w:t>
+      </w:r>
+    </w:p>
+    <w:p>
+      <w:pPr>
+        <w:pStyle w:val="Paragraphedeliste"/>
+        <w:numPr>
+          <w:ilvl w:val="0"/>
+          <w:numId w:val="1"/>
+        </w:numPr>
+      </w:pPr>
+      <w:r>
+        <w:t>Now it would be good if the agent would use the output of another Thing to execute. Let’s try to add a text node.</w:t>
+      </w:r>
+    </w:p>
+    <w:p>
+      <w:pPr>
+        <w:pStyle w:val="Paragraphedeliste"/>
+        <w:numPr>
+          <w:ilvl w:val="1"/>
+          <w:numId w:val="1"/>
+        </w:numPr>
+      </w:pPr>
+      <w:r>
+        <w:t>Add a text node, and enter “Brazil”</w:t>
+      </w:r>
+    </w:p>
+    <w:p>
+      <w:pPr>
+        <w:pStyle w:val="Paragraphedeliste"/>
+        <w:numPr>
+          <w:ilvl w:val="1"/>
+          <w:numId w:val="1"/>
+        </w:numPr>
+      </w:pPr>
+      <w:r>
+        <w:t>Make a link between the text node and the agent</w:t>
+      </w:r>
+    </w:p>
+    <w:p>
+      <w:pPr>
+        <w:pStyle w:val="Paragraphedeliste"/>
+        <w:numPr>
+          <w:ilvl w:val="1"/>
+          <w:numId w:val="1"/>
+        </w:numPr>
+      </w:pPr>
+      <w:r>
+        <w:t>Click run… Nothing changes</w:t>
+      </w:r>
+    </w:p>
+    <w:p>
+      <w:pPr>
+        <w:pStyle w:val="Paragraphedeliste"/>
+        <w:numPr>
+          <w:ilvl w:val="1"/>
+          <w:numId w:val="1"/>
+        </w:numPr>
+      </w:pPr>
+      <w:r>
+        <w:t>Let’s try to see the parameters… Oh it has changed. The node has detected that it is connected to something and that we could retrieve input from there…</w:t>
+      </w:r>
+    </w:p>
+    <w:p>
+      <w:pPr>
+        <w:pStyle w:val="Paragraphedeliste"/>
+        <w:numPr>
+          <w:ilvl w:val="1"/>
+          <w:numId w:val="1"/>
+        </w:numPr>
+      </w:pPr>
+      <w:r>
+        <w:t>Now we can decide to use the text node (named “Brazil”); Use that and re-run</w:t>
+      </w:r>
+    </w:p>
+    <w:p>
+      <w:pPr>
+        <w:pStyle w:val="Paragraphedeliste"/>
+        <w:numPr>
+          <w:ilvl w:val="1"/>
+          <w:numId w:val="1"/>
+        </w:numPr>
+      </w:pPr>
+      <w:r>
+        <w:t>For clarity, change the name of the text node (“Country”) and validate. You see that the name has changed in the MCP Tool Node.</w:t>
+      </w:r>
+    </w:p>
+    <w:p>
+      <w:pPr>
+        <w:pStyle w:val="Titre1"/>
+        <w:rPr>
+          <w:lang w:val="de-DE"/>
+        </w:rPr>
+      </w:pPr>
+      <w:r>
+        <w:rPr>
+          <w:lang w:val="de-DE"/>
+        </w:rPr>
+        <w:t>8 – Smart Analysis</w:t>
+      </w:r>
+    </w:p>
+    <w:p>
+      <w:r>
+        <w:t>Smart Analyses are tools t</w:t>
+      </w:r>
+      <w:r>
+        <w:t>hat can be defined by users to perform analysis on nodes.</w:t>
+      </w:r>
+    </w:p>
+    <w:p>
+      <w:r>
+        <w:t>Let’s try a smart analysis:</w:t>
+      </w:r>
+    </w:p>
+    <w:p>
+      <w:pPr>
+        <w:pStyle w:val="Paragraphedeliste"/>
+        <w:numPr>
+          <w:ilvl w:val="0"/>
+          <w:numId w:val="1"/>
+        </w:numPr>
+      </w:pPr>
+      <w:r>
+        <w:t>Righ</w:t>
+      </w:r>
+      <w:r>
+        <w:t>t</w:t>
+      </w:r>
+      <w:r>
+        <w:t xml:space="preserve">-Click on a node (e.g. </w:t>
+      </w:r>
+      <w:r>
+        <w:t>Scanned - Flexibilität in der Altersversicherung.pdf</w:t>
+      </w:r>
+      <w:r>
+        <w:t>) and select „Swot“. S</w:t>
+      </w:r>
+      <w:r>
+        <w:t>ee the result</w:t>
+      </w:r>
+    </w:p>
+    <w:p>
+      <w:pPr>
+        <w:pStyle w:val="Paragraphedeliste"/>
+        <w:numPr>
+          <w:ilvl w:val="0"/>
+          <w:numId w:val="1"/>
+        </w:numPr>
+      </w:pPr>
+      <w:r>
+        <w:t>We can have more than just LLM analysis with the Smart Analysis tool, for example</w:t>
+      </w:r>
+    </w:p>
+    <w:p>
+      <w:pPr>
+        <w:pStyle w:val="Paragraphedeliste"/>
+        <w:numPr>
+          <w:ilvl w:val="1"/>
+          <w:numId w:val="1"/>
+        </w:numPr>
+      </w:pPr>
+      <w:r>
+        <w:t xml:space="preserve">Let’s drop an Excel file. Use </w:t>
+      </w:r>
+      <w:r>
+        <w:t>je-d-13.02.02.06.xlsx</w:t>
+      </w:r>
+    </w:p>
+    <w:p>
+      <w:pPr>
+        <w:pStyle w:val="Paragraphedeliste"/>
+        <w:numPr>
+          <w:ilvl w:val="1"/>
+          <w:numId w:val="1"/>
+        </w:numPr>
+      </w:pPr>
+      <w:r>
+        <w:t>Select the first lines and create a chart</w:t>
+      </w:r>
+    </w:p>
+    <w:p>
+      <w:pPr>
+        <w:pStyle w:val="Paragraphedeliste"/>
+        <w:numPr>
+          <w:ilvl w:val="0"/>
+          <w:numId w:val="1"/>
+        </w:numPr>
+      </w:pPr>
+      <w:r>
+        <w:t xml:space="preserve">If time allows, drop </w:t>
+      </w:r>
+      <w:r>
+        <w:t>do-d-00.01-pan-01-Page2.pdf</w:t>
+      </w:r>
+      <w:r>
+        <w:t xml:space="preserve"> and do a chart on the table</w:t>
+      </w:r>
+    </w:p>
+    <w:p>
+      <w:pPr>
+        <w:pStyle w:val="Paragraphedeliste"/>
+        <w:numPr>
+          <w:ilvl w:val="0"/>
+          <w:numId w:val="1"/>
+        </w:numPr>
+      </w:pPr>
+      <w:r>
+        <w:t>Wh</w:t>
+      </w:r>
+      <w:r>
+        <w:t>ile it is doing its analysis, let’s have a look at how it is built.</w:t>
+      </w:r>
+    </w:p>
+    <w:p>
+      <w:pPr>
+        <w:pStyle w:val="Paragraphedeliste"/>
+        <w:numPr>
+          <w:ilvl w:val="1"/>
+          <w:numId w:val="1"/>
+        </w:numPr>
+      </w:pPr>
+      <w:r>
+        <w:t xml:space="preserve">Go to the Smart Analysis Builder and describe the icons at the left. </w:t>
+      </w:r>
+    </w:p>
+    <w:p>
+      <w:pPr>
+        <w:pStyle w:val="Paragraphedeliste"/>
+        <w:numPr>
+          <w:ilvl w:val="1"/>
+          <w:numId w:val="1"/>
+        </w:numPr>
+      </w:pPr>
+      <w:r>
+        <w:t>Go to the admin section and describe how we can configure things</w:t>
+      </w:r>
+    </w:p>
+    <w:p>
+      <w:pPr>
+        <w:pStyle w:val="Paragraphedeliste"/>
+        <w:numPr>
+          <w:ilvl w:val="1"/>
+          <w:numId w:val="1"/>
+        </w:numPr>
+      </w:pPr>
+      <w:r>
+        <w:t>Open the SWOT analysis and describe the different steps</w:t>
+      </w:r>
+    </w:p>
+    <w:p>
+      <w:pPr>
+        <w:pStyle w:val="Paragraphedeliste"/>
+        <w:numPr>
+          <w:ilvl w:val="1"/>
+          <w:numId w:val="1"/>
+        </w:numPr>
+      </w:pPr>
+      <w:r>
+        <w:t>Notice the tooltips that provide some help</w:t>
+      </w:r>
+    </w:p>
+    <w:p>
+      <w:pPr>
+        <w:pStyle w:val="Paragraphedeliste"/>
+        <w:numPr>
+          <w:ilvl w:val="0"/>
+          <w:numId w:val="1"/>
+        </w:numPr>
+      </w:pPr>
+      <w:r>
+        <w:t>Once the chart is done show it. And explain that this is a React component</w:t>
+      </w:r>
+    </w:p>
+    <w:p/>
+    <w:p>
+      <w:r>
+        <w:t>Let’s create a smart analysis:</w:t>
+      </w:r>
+    </w:p>
+    <w:p>
+      <w:pPr>
+        <w:pStyle w:val="Paragraphedeliste"/>
+        <w:numPr>
+          <w:ilvl w:val="0"/>
+          <w:numId w:val="1"/>
+        </w:numPr>
+      </w:pPr>
+      <w:r>
+        <w:t>We will create a benchmark</w:t>
+      </w:r>
+    </w:p>
+    <w:p>
+      <w:pPr>
+        <w:pStyle w:val="Paragraphedeliste"/>
+        <w:numPr>
+          <w:ilvl w:val="1"/>
+          <w:numId w:val="1"/>
+        </w:numPr>
+      </w:pPr>
+      <w:r>
+        <w:t>EXTRACTOR</w:t>
+      </w:r>
+    </w:p>
+    <w:p>
+      <w:pPr>
+        <w:pStyle w:val="Paragraphedeliste"/>
+        <w:numPr>
+          <w:ilvl w:val="2"/>
+          <w:numId w:val="1"/>
+        </w:numPr>
+      </w:pPr>
+      <w:r>
+        <w:t>Extraction mode: Semantic Analysis</w:t>
+      </w:r>
+    </w:p>
+    <w:p>
+      <w:pPr>
+        <w:pStyle w:val="Paragraphedeliste"/>
+        <w:numPr>
+          <w:ilvl w:val="2"/>
+          <w:numId w:val="1"/>
+        </w:numPr>
+      </w:pPr>
+      <w:r>
+        <w:t>Full Document</w:t>
+      </w:r>
+    </w:p>
+    <w:p>
+      <w:pPr>
+        <w:pStyle w:val="Paragraphedeliste"/>
+        <w:numPr>
+          <w:ilvl w:val="2"/>
+          <w:numId w:val="1"/>
+        </w:numPr>
+      </w:pPr>
+      <w:r>
+        <w:t>Extraction focus : “</w:t>
+      </w:r>
+      <w:r>
+        <w:t>All topics related to It Architecture</w:t>
+      </w:r>
+      <w:r>
+        <w:t>”</w:t>
+      </w:r>
+    </w:p>
+    <w:p>
+      <w:pPr>
+        <w:pStyle w:val="Paragraphedeliste"/>
+        <w:numPr>
+          <w:ilvl w:val="2"/>
+          <w:numId w:val="1"/>
+        </w:numPr>
+      </w:pPr>
+      <w:r>
+        <w:t xml:space="preserve">Exclude Pattern: “Any </w:t>
+      </w:r>
+      <w:r>
+        <w:t>topic</w:t>
+      </w:r>
+      <w:r>
+        <w:t xml:space="preserve"> NOT</w:t>
+      </w:r>
+      <w:r>
+        <w:t xml:space="preserve"> related to It Architecture</w:t>
+      </w:r>
+      <w:r>
+        <w:t>”</w:t>
+      </w:r>
+    </w:p>
+    <w:p>
+      <w:pPr>
+        <w:pStyle w:val="Paragraphedeliste"/>
+        <w:numPr>
+          <w:ilvl w:val="2"/>
+          <w:numId w:val="1"/>
+        </w:numPr>
+      </w:pPr>
+      <w:r>
+        <w:t>No additional Instruction</w:t>
+      </w:r>
+    </w:p>
+    <w:p>
+      <w:pPr>
+        <w:pStyle w:val="Paragraphedeliste"/>
+        <w:numPr>
+          <w:ilvl w:val="2"/>
+          <w:numId w:val="1"/>
+        </w:numPr>
+      </w:pPr>
+      <w:r>
+        <w:t>Save as “IT Architecture Benchmark”</w:t>
+      </w:r>
+    </w:p>
+    <w:p>
+      <w:pPr>
+        <w:pStyle w:val="Paragraphedeliste"/>
+        <w:numPr>
+          <w:ilvl w:val="1"/>
+          <w:numId w:val="1"/>
+        </w:numPr>
+      </w:pPr>
+      <w:r>
+        <w:t>AGENT</w:t>
+      </w:r>
+    </w:p>
+    <w:p>
+      <w:pPr>
+        <w:pStyle w:val="Paragraphedeliste"/>
+        <w:numPr>
+          <w:ilvl w:val="2"/>
+          <w:numId w:val="1"/>
+        </w:numPr>
+      </w:pPr>
+      <w:r>
+        <w:t>Persona: Auditor</w:t>
+      </w:r>
+    </w:p>
+    <w:p>
+      <w:pPr>
+        <w:pStyle w:val="Paragraphedeliste"/>
+        <w:numPr>
+          <w:ilvl w:val="2"/>
+          <w:numId w:val="1"/>
+        </w:numPr>
+      </w:pPr>
+      <w:r>
+        <w:t>Framework: TOGAF</w:t>
+      </w:r>
+    </w:p>
+    <w:p>
+      <w:pPr>
+        <w:pStyle w:val="Paragraphedeliste"/>
+        <w:numPr>
+          <w:ilvl w:val="2"/>
+          <w:numId w:val="1"/>
+        </w:numPr>
+      </w:pPr>
+      <w:r>
+        <w:t>Reasoning Depth: Medium</w:t>
+      </w:r>
+    </w:p>
+    <w:p>
+      <w:pPr>
+        <w:pStyle w:val="Paragraphedeliste"/>
+        <w:numPr>
+          <w:ilvl w:val="2"/>
+          <w:numId w:val="1"/>
+        </w:numPr>
+      </w:pPr>
+      <w:r>
+        <w:t>Objective: “</w:t>
+      </w:r>
+      <w:r>
+        <w:t>Do a benchmark of the provided document, based on the recommended framework</w:t>
+      </w:r>
+      <w:r>
+        <w:t>”</w:t>
+      </w:r>
+    </w:p>
+    <w:p>
+      <w:pPr>
+        <w:pStyle w:val="Paragraphedeliste"/>
+        <w:numPr>
+          <w:ilvl w:val="1"/>
+          <w:numId w:val="1"/>
+        </w:numPr>
+      </w:pPr>
+      <w:r>
+        <w:t>VISUALIZER</w:t>
+      </w:r>
+    </w:p>
+    <w:p>
+      <w:pPr>
+        <w:pStyle w:val="Paragraphedeliste"/>
+        <w:numPr>
+          <w:ilvl w:val="2"/>
+          <w:numId w:val="1"/>
+        </w:numPr>
+      </w:pPr>
+      <w:r>
+        <w:t>Formated Text / Extensive Report</w:t>
+      </w:r>
+    </w:p>
+    <w:p>
+      <w:pPr>
+        <w:pStyle w:val="Paragraphedeliste"/>
+        <w:numPr>
+          <w:ilvl w:val="1"/>
+          <w:numId w:val="1"/>
+        </w:numPr>
+      </w:pPr>
+      <w:r>
+        <w:t>FORMATER</w:t>
+      </w:r>
+    </w:p>
+    <w:p>
+      <w:pPr>
+        <w:pStyle w:val="Paragraphedeliste"/>
+        <w:numPr>
+          <w:ilvl w:val="2"/>
+          <w:numId w:val="1"/>
+        </w:numPr>
+      </w:pPr>
+      <w:r>
+        <w:t>Text / Markdown</w:t>
       </w:r>
     </w:p>
     <w:p/>

</xml_diff>